<commit_message>
Added DSA recursion and DSA real-life usage concepts
</commit_message>
<xml_diff>
--- a/programming_mental_models/p3_types_of_api_and_api_security.docx
+++ b/programming_mental_models/p3_types_of_api_and_api_security.docx
@@ -3089,23 +3089,7 @@
           <w:sz w:val="32"/>
           <w:szCs w:val="32"/>
         </w:rPr>
-        <w:t xml:space="preserve"># This prevents the password being transmitted in plain form. But </w:t>
-      </w:r>
-      <w:proofErr w:type="spellStart"/>
-      <w:r>
-        <w:rPr>
-          <w:sz w:val="32"/>
-          <w:szCs w:val="32"/>
-        </w:rPr>
-        <w:t>its</w:t>
-      </w:r>
-      <w:proofErr w:type="spellEnd"/>
-      <w:r>
-        <w:rPr>
-          <w:sz w:val="32"/>
-          <w:szCs w:val="32"/>
-        </w:rPr>
-        <w:t xml:space="preserve"> more complex and not widely used in modern systems because token-based approaches are easier to scale</w:t>
+        <w:t># This prevents the password being transmitted in plain form. But its more complex and not widely used in modern systems because token-based approaches are easier to scale</w:t>
       </w:r>
     </w:p>
     <w:p>
@@ -3802,23 +3786,7 @@
           <w:sz w:val="32"/>
           <w:szCs w:val="32"/>
         </w:rPr>
-        <w:t xml:space="preserve">. Which is Base64 </w:t>
-      </w:r>
-      <w:proofErr w:type="spellStart"/>
-      <w:r>
-        <w:rPr>
-          <w:sz w:val="32"/>
-          <w:szCs w:val="32"/>
-        </w:rPr>
-        <w:t>endcoded</w:t>
-      </w:r>
-      <w:proofErr w:type="spellEnd"/>
-      <w:r>
-        <w:rPr>
-          <w:sz w:val="32"/>
-          <w:szCs w:val="32"/>
-        </w:rPr>
-        <w:t>.</w:t>
+        <w:t>. Which is Base64 encoded.</w:t>
       </w:r>
     </w:p>
     <w:p>
@@ -9307,6 +9275,7 @@
   <w:style w:type="character" w:default="1" w:styleId="DefaultParagraphFont">
     <w:name w:val="Default Paragraph Font"/>
     <w:uiPriority w:val="1"/>
+    <w:semiHidden/>
     <w:unhideWhenUsed/>
   </w:style>
   <w:style w:type="table" w:default="1" w:styleId="TableNormal">

</xml_diff>